<commit_message>
HouseCheck case study: narrated walkthrough, and the test count as run today
The silent search loop becomes a narrated walkthrough (1:57, captions on by
default): the live app on a phone with an enlarged detail that follows the
fingertip, then the exported file verified offline with HouseCheck's own code,
tampered with one character, and forged. The terminal output is real.

The test count was stale: cargo test --workspace passes 176 today (clippy
-D warnings clean), not 149. Updated on the card, the figures, and the résumé
in every format.

Co-Authored-By: Claude Opus 5.5 <noreply@anthropic.com>
</commit_message>
<xml_diff>
--- a/assets/docs/resume/resume-legal.docx
+++ b/assets/docs/resume/resume-legal.docx
@@ -93,7 +93,7 @@
         </w:rPr>
         <w:t xml:space="preserve"> </w:t>
       </w:r>
-      <w:hyperlink w:history="1" r:id="rIdljbfy2qkpqph7u6n8ok5r">
+      <w:hyperlink w:history="1" r:id="rId7rvlayeobdmd9w7z22n1c">
         <w:r>
           <w:rPr>
             <w:rFonts w:ascii="Times New Roman" w:cs="Times New Roman" w:eastAsia="Times New Roman" w:hAnsi="Times New Roman"/>
@@ -160,7 +160,7 @@
         </w:rPr>
         <w:t xml:space="preserve"> </w:t>
       </w:r>
-      <w:hyperlink w:history="1" r:id="rIdoq_hjvcx9c2rhtrafrbkk">
+      <w:hyperlink w:history="1" r:id="rIdswk3g9ydezaib3wvspvoo">
         <w:r>
           <w:rPr>
             <w:rFonts w:ascii="Times New Roman" w:cs="Times New Roman" w:eastAsia="Times New Roman" w:hAnsi="Times New Roman"/>
@@ -227,7 +227,7 @@
         </w:rPr>
         <w:t xml:space="preserve"> </w:t>
       </w:r>
-      <w:hyperlink w:history="1" r:id="rIdycfvv4-zkxzshonuvszk9">
+      <w:hyperlink w:history="1" r:id="rIdjjua-f1-gyzjuoscav1tv">
         <w:r>
           <w:rPr>
             <w:rFonts w:ascii="Times New Roman" w:cs="Times New Roman" w:eastAsia="Times New Roman" w:hAnsi="Times New Roman"/>
@@ -787,7 +787,7 @@
           <w:sz w:val="18"/>
           <w:szCs w:val="18"/>
         </w:rPr>
-        <w:t xml:space="preserve">Building Health Card scored from public NYC data, with an export a stranger can verify offline. Live; 149 tests.</w:t>
+        <w:t xml:space="preserve">Building Health Card scored from public NYC data, with an export a stranger can verify offline. Live; 176 tests.</w:t>
       </w:r>
       <w:r>
         <w:rPr>
@@ -797,14 +797,14 @@
         </w:rPr>
         <w:t xml:space="preserve">	</w:t>
       </w:r>
-      <w:hyperlink w:history="1" r:id="rIdlwp7vwl-chqzfryo0fhft">
+      <w:hyperlink w:history="1" r:id="rIdbnjl0c_xw6mfr5pykquly">
         <w:r>
           <w:drawing>
             <wp:inline distT="0" distB="0" distL="0" distR="0">
               <wp:extent cx="101575" cy="101575"/>
               <wp:effectExtent t="0" r="0" b="0" l="0"/>
               <wp:docPr id="10" name="GitHub" descr="GitHub" title="GitHub">
-                <a:hlinkClick xmlns:a="http://schemas.openxmlformats.org/drawingml/2006/main" r:id="rIdlwp7vwl-chqzfryo0fhft"/>
+                <a:hlinkClick xmlns:a="http://schemas.openxmlformats.org/drawingml/2006/main" r:id="rIdbnjl0c_xw6mfr5pykquly"/>
               </wp:docPr>
               <wp:cNvGraphicFramePr>
                 <a:graphicFrameLocks xmlns:a="http://schemas.openxmlformats.org/drawingml/2006/main" noChangeAspect="1"/>
@@ -814,7 +814,7 @@
                   <pic:pic xmlns:pic="http://schemas.openxmlformats.org/drawingml/2006/picture">
                     <pic:nvPicPr>
                       <pic:cNvPr id="0" name="" descr="">
-                        <a:hlinkClick r:id="rIdlwp7vwl-chqzfryo0fhft"/>
+                        <a:hlinkClick r:id="rIdbnjl0c_xw6mfr5pykquly"/>
                       </pic:cNvPr>
                       <pic:cNvPicPr>
                         <a:picLocks noChangeAspect="1" noChangeArrowheads="1"/>
@@ -959,14 +959,14 @@
         </w:rPr>
         <w:t xml:space="preserve">	</w:t>
       </w:r>
-      <w:hyperlink w:history="1" r:id="rId2osv80iqvoolp9cmcu-dm">
+      <w:hyperlink w:history="1" r:id="rIdyj7dgrx4zqx6omu1azav3">
         <w:r>
           <w:drawing>
             <wp:inline distT="0" distB="0" distL="0" distR="0">
               <wp:extent cx="101575" cy="101575"/>
               <wp:effectExtent t="0" r="0" b="0" l="0"/>
               <wp:docPr id="11" name="GitHub" descr="GitHub" title="GitHub">
-                <a:hlinkClick xmlns:a="http://schemas.openxmlformats.org/drawingml/2006/main" r:id="rId2osv80iqvoolp9cmcu-dm"/>
+                <a:hlinkClick xmlns:a="http://schemas.openxmlformats.org/drawingml/2006/main" r:id="rIdyj7dgrx4zqx6omu1azav3"/>
               </wp:docPr>
               <wp:cNvGraphicFramePr>
                 <a:graphicFrameLocks xmlns:a="http://schemas.openxmlformats.org/drawingml/2006/main" noChangeAspect="1"/>
@@ -976,7 +976,7 @@
                   <pic:pic xmlns:pic="http://schemas.openxmlformats.org/drawingml/2006/picture">
                     <pic:nvPicPr>
                       <pic:cNvPr id="0" name="" descr="">
-                        <a:hlinkClick r:id="rId2osv80iqvoolp9cmcu-dm"/>
+                        <a:hlinkClick r:id="rIdyj7dgrx4zqx6omu1azav3"/>
                       </pic:cNvPr>
                       <pic:cNvPicPr>
                         <a:picLocks noChangeAspect="1" noChangeArrowheads="1"/>
@@ -1103,14 +1103,14 @@
         </w:rPr>
         <w:t xml:space="preserve">	</w:t>
       </w:r>
-      <w:hyperlink w:history="1" r:id="rId349ewd96d1so5pyglf23m">
+      <w:hyperlink w:history="1" r:id="rIda4xomugiusorvsc4zxpu5">
         <w:r>
           <w:drawing>
             <wp:inline distT="0" distB="0" distL="0" distR="0">
               <wp:extent cx="101575" cy="101575"/>
               <wp:effectExtent t="0" r="0" b="0" l="0"/>
               <wp:docPr id="12" name="GitHub" descr="GitHub" title="GitHub">
-                <a:hlinkClick xmlns:a="http://schemas.openxmlformats.org/drawingml/2006/main" r:id="rId349ewd96d1so5pyglf23m"/>
+                <a:hlinkClick xmlns:a="http://schemas.openxmlformats.org/drawingml/2006/main" r:id="rIda4xomugiusorvsc4zxpu5"/>
               </wp:docPr>
               <wp:cNvGraphicFramePr>
                 <a:graphicFrameLocks xmlns:a="http://schemas.openxmlformats.org/drawingml/2006/main" noChangeAspect="1"/>
@@ -1120,7 +1120,7 @@
                   <pic:pic xmlns:pic="http://schemas.openxmlformats.org/drawingml/2006/picture">
                     <pic:nvPicPr>
                       <pic:cNvPr id="0" name="" descr="">
-                        <a:hlinkClick r:id="rId349ewd96d1so5pyglf23m"/>
+                        <a:hlinkClick r:id="rIda4xomugiusorvsc4zxpu5"/>
                       </pic:cNvPr>
                       <pic:cNvPicPr>
                         <a:picLocks noChangeAspect="1" noChangeArrowheads="1"/>

</xml_diff>